<commit_message>
README e informe: vista previa del tablero y anexo de capturas
KR4 actualizado: tablero de 7 paginas con aviso de frescura, no publicado en el servicio.
</commit_message>
<xml_diff>
--- a/INFORME_FINAL.docx
+++ b/INFORME_FINAL.docx
@@ -2952,7 +2952,7 @@
                 <w:b w:val="0"/>
                 <w:sz w:val="18"/>
               </w:rPr>
-              <w:t xml:space="preserve"> Tablero de 7 páginas con advertencias; archivo </w:t>
+              <w:t xml:space="preserve"> Tablero de 7 páginas con advertencia de frescura en cada una (capturas en el anexo B). El </w:t>
             </w:r>
             <w:r>
               <w:rPr>
@@ -2967,7 +2967,7 @@
                 <w:b w:val="0"/>
                 <w:sz w:val="18"/>
               </w:rPr>
-              <w:t xml:space="preserve"> y PDF se entregan aparte (no se versionan)</w:t>
+              <w:t xml:space="preserve"> y su PDF se entregan aparte; no está publicado en el servicio de Power BI</w:t>
             </w:r>
           </w:p>
         </w:tc>
@@ -4720,6 +4720,51 @@
       </w:r>
     </w:p>
     <w:p>
+      <w:r>
+        <w:drawing>
+          <wp:inline xmlns:a="http://schemas.openxmlformats.org/drawingml/2006/main" xmlns:pic="http://schemas.openxmlformats.org/drawingml/2006/picture">
+            <wp:extent cx="5760720" cy="2882323"/>
+            <wp:docPr id="1" name="Picture 1"/>
+            <wp:cNvGraphicFramePr>
+              <a:graphicFrameLocks noChangeAspect="1"/>
+            </wp:cNvGraphicFramePr>
+            <a:graphic>
+              <a:graphicData uri="http://schemas.openxmlformats.org/drawingml/2006/picture">
+                <pic:pic>
+                  <pic:nvPicPr>
+                    <pic:cNvPr id="0" name="pagina_1_estado_actual.png"/>
+                    <pic:cNvPicPr/>
+                  </pic:nvPicPr>
+                  <pic:blipFill>
+                    <a:blip r:embed="rId9"/>
+                    <a:stretch>
+                      <a:fillRect/>
+                    </a:stretch>
+                  </pic:blipFill>
+                  <pic:spPr>
+                    <a:xfrm>
+                      <a:off x="0" y="0"/>
+                      <a:ext cx="5760720" cy="2882323"/>
+                    </a:xfrm>
+                    <a:prstGeom prst="rect"/>
+                  </pic:spPr>
+                </pic:pic>
+              </a:graphicData>
+            </a:graphic>
+          </wp:inline>
+        </w:drawing>
+      </w:r>
+    </w:p>
+    <w:p>
+      <w:r>
+        <w:rPr>
+          <w:i/>
+          <w:sz w:val="18"/>
+        </w:rPr>
+        <w:t>Página 1 del tablero: estado actual del servicio</w:t>
+      </w:r>
+    </w:p>
+    <w:p>
       <w:pPr>
         <w:pStyle w:val="Heading1"/>
       </w:pPr>
@@ -5985,6 +6030,354 @@
       </w:tr>
     </w:tbl>
     <w:p/>
+    <w:p>
+      <w:pPr>
+        <w:pStyle w:val="Heading1"/>
+      </w:pPr>
+      <w:r>
+        <w:rPr>
+          <w:b w:val="0"/>
+        </w:rPr>
+        <w:t>Anexo B. Capturas del tablero</w:t>
+      </w:r>
+    </w:p>
+    <w:p>
+      <w:r>
+        <w:rPr>
+          <w:b w:val="0"/>
+        </w:rPr>
+        <w:t>Exportadas desde Power BI Desktop (</w:t>
+      </w:r>
+      <w:r>
+        <w:rPr>
+          <w:rFonts w:ascii="Consolas" w:hAnsi="Consolas"/>
+          <w:b w:val="0"/>
+          <w:sz w:val="18"/>
+        </w:rPr>
+        <w:t>ZNI_tablero.pdf</w:t>
+      </w:r>
+      <w:r>
+        <w:rPr>
+          <w:b w:val="0"/>
+        </w:rPr>
+        <w:t>). Cada página lleva el aviso de frescura de las fuentes que usa.</w:t>
+      </w:r>
+    </w:p>
+    <w:p>
+      <w:r>
+        <w:drawing>
+          <wp:inline xmlns:a="http://schemas.openxmlformats.org/drawingml/2006/main" xmlns:pic="http://schemas.openxmlformats.org/drawingml/2006/picture">
+            <wp:extent cx="5760720" cy="2882323"/>
+            <wp:docPr id="2" name="Picture 2"/>
+            <wp:cNvGraphicFramePr>
+              <a:graphicFrameLocks noChangeAspect="1"/>
+            </wp:cNvGraphicFramePr>
+            <a:graphic>
+              <a:graphicData uri="http://schemas.openxmlformats.org/drawingml/2006/picture">
+                <pic:pic>
+                  <pic:nvPicPr>
+                    <pic:cNvPr id="0" name="pagina_1_estado_actual.png"/>
+                    <pic:cNvPicPr/>
+                  </pic:nvPicPr>
+                  <pic:blipFill>
+                    <a:blip r:embed="rId9"/>
+                    <a:stretch>
+                      <a:fillRect/>
+                    </a:stretch>
+                  </pic:blipFill>
+                  <pic:spPr>
+                    <a:xfrm>
+                      <a:off x="0" y="0"/>
+                      <a:ext cx="5760720" cy="2882323"/>
+                    </a:xfrm>
+                    <a:prstGeom prst="rect"/>
+                  </pic:spPr>
+                </pic:pic>
+              </a:graphicData>
+            </a:graphic>
+          </wp:inline>
+        </w:drawing>
+      </w:r>
+    </w:p>
+    <w:p>
+      <w:r>
+        <w:rPr>
+          <w:i/>
+          <w:sz w:val="18"/>
+        </w:rPr>
+        <w:t>Página 1: estado actual</w:t>
+      </w:r>
+    </w:p>
+    <w:p>
+      <w:r>
+        <w:drawing>
+          <wp:inline xmlns:a="http://schemas.openxmlformats.org/drawingml/2006/main" xmlns:pic="http://schemas.openxmlformats.org/drawingml/2006/picture">
+            <wp:extent cx="5760720" cy="3280465"/>
+            <wp:docPr id="3" name="Picture 3"/>
+            <wp:cNvGraphicFramePr>
+              <a:graphicFrameLocks noChangeAspect="1"/>
+            </wp:cNvGraphicFramePr>
+            <a:graphic>
+              <a:graphicData uri="http://schemas.openxmlformats.org/drawingml/2006/picture">
+                <pic:pic>
+                  <pic:nvPicPr>
+                    <pic:cNvPr id="0" name="pagina_2_brechas.png"/>
+                    <pic:cNvPicPr/>
+                  </pic:nvPicPr>
+                  <pic:blipFill>
+                    <a:blip r:embed="rId10"/>
+                    <a:stretch>
+                      <a:fillRect/>
+                    </a:stretch>
+                  </pic:blipFill>
+                  <pic:spPr>
+                    <a:xfrm>
+                      <a:off x="0" y="0"/>
+                      <a:ext cx="5760720" cy="3280465"/>
+                    </a:xfrm>
+                    <a:prstGeom prst="rect"/>
+                  </pic:spPr>
+                </pic:pic>
+              </a:graphicData>
+            </a:graphic>
+          </wp:inline>
+        </w:drawing>
+      </w:r>
+    </w:p>
+    <w:p>
+      <w:r>
+        <w:rPr>
+          <w:i/>
+          <w:sz w:val="18"/>
+        </w:rPr>
+        <w:t>Página 2: brechas</w:t>
+      </w:r>
+    </w:p>
+    <w:p>
+      <w:r>
+        <w:drawing>
+          <wp:inline xmlns:a="http://schemas.openxmlformats.org/drawingml/2006/main" xmlns:pic="http://schemas.openxmlformats.org/drawingml/2006/picture">
+            <wp:extent cx="5760720" cy="3280465"/>
+            <wp:docPr id="4" name="Picture 4"/>
+            <wp:cNvGraphicFramePr>
+              <a:graphicFrameLocks noChangeAspect="1"/>
+            </wp:cNvGraphicFramePr>
+            <a:graphic>
+              <a:graphicData uri="http://schemas.openxmlformats.org/drawingml/2006/picture">
+                <pic:pic>
+                  <pic:nvPicPr>
+                    <pic:cNvPr id="0" name="pagina_3_evolucion.png"/>
+                    <pic:cNvPicPr/>
+                  </pic:nvPicPr>
+                  <pic:blipFill>
+                    <a:blip r:embed="rId11"/>
+                    <a:stretch>
+                      <a:fillRect/>
+                    </a:stretch>
+                  </pic:blipFill>
+                  <pic:spPr>
+                    <a:xfrm>
+                      <a:off x="0" y="0"/>
+                      <a:ext cx="5760720" cy="3280465"/>
+                    </a:xfrm>
+                    <a:prstGeom prst="rect"/>
+                  </pic:spPr>
+                </pic:pic>
+              </a:graphicData>
+            </a:graphic>
+          </wp:inline>
+        </w:drawing>
+      </w:r>
+    </w:p>
+    <w:p>
+      <w:r>
+        <w:rPr>
+          <w:i/>
+          <w:sz w:val="18"/>
+        </w:rPr>
+        <w:t>Página 3: evolución mensual</w:t>
+      </w:r>
+    </w:p>
+    <w:p>
+      <w:r>
+        <w:drawing>
+          <wp:inline xmlns:a="http://schemas.openxmlformats.org/drawingml/2006/main" xmlns:pic="http://schemas.openxmlformats.org/drawingml/2006/picture">
+            <wp:extent cx="5760720" cy="3280465"/>
+            <wp:docPr id="5" name="Picture 5"/>
+            <wp:cNvGraphicFramePr>
+              <a:graphicFrameLocks noChangeAspect="1"/>
+            </wp:cNvGraphicFramePr>
+            <a:graphic>
+              <a:graphicData uri="http://schemas.openxmlformats.org/drawingml/2006/picture">
+                <pic:pic>
+                  <pic:nvPicPr>
+                    <pic:cNvPr id="0" name="pagina_4_operadores.png"/>
+                    <pic:cNvPicPr/>
+                  </pic:nvPicPr>
+                  <pic:blipFill>
+                    <a:blip r:embed="rId12"/>
+                    <a:stretch>
+                      <a:fillRect/>
+                    </a:stretch>
+                  </pic:blipFill>
+                  <pic:spPr>
+                    <a:xfrm>
+                      <a:off x="0" y="0"/>
+                      <a:ext cx="5760720" cy="3280465"/>
+                    </a:xfrm>
+                    <a:prstGeom prst="rect"/>
+                  </pic:spPr>
+                </pic:pic>
+              </a:graphicData>
+            </a:graphic>
+          </wp:inline>
+        </w:drawing>
+      </w:r>
+    </w:p>
+    <w:p>
+      <w:r>
+        <w:rPr>
+          <w:i/>
+          <w:sz w:val="18"/>
+        </w:rPr>
+        <w:t>Página 4: operadores</w:t>
+      </w:r>
+    </w:p>
+    <w:p>
+      <w:r>
+        <w:drawing>
+          <wp:inline xmlns:a="http://schemas.openxmlformats.org/drawingml/2006/main" xmlns:pic="http://schemas.openxmlformats.org/drawingml/2006/picture">
+            <wp:extent cx="5760720" cy="3280465"/>
+            <wp:docPr id="6" name="Picture 6"/>
+            <wp:cNvGraphicFramePr>
+              <a:graphicFrameLocks noChangeAspect="1"/>
+            </wp:cNvGraphicFramePr>
+            <a:graphic>
+              <a:graphicData uri="http://schemas.openxmlformats.org/drawingml/2006/picture">
+                <pic:pic>
+                  <pic:nvPicPr>
+                    <pic:cNvPr id="0" name="pagina_5_pqr.png"/>
+                    <pic:cNvPicPr/>
+                  </pic:nvPicPr>
+                  <pic:blipFill>
+                    <a:blip r:embed="rId13"/>
+                    <a:stretch>
+                      <a:fillRect/>
+                    </a:stretch>
+                  </pic:blipFill>
+                  <pic:spPr>
+                    <a:xfrm>
+                      <a:off x="0" y="0"/>
+                      <a:ext cx="5760720" cy="3280465"/>
+                    </a:xfrm>
+                    <a:prstGeom prst="rect"/>
+                  </pic:spPr>
+                </pic:pic>
+              </a:graphicData>
+            </a:graphic>
+          </wp:inline>
+        </w:drawing>
+      </w:r>
+    </w:p>
+    <w:p>
+      <w:r>
+        <w:rPr>
+          <w:i/>
+          <w:sz w:val="18"/>
+        </w:rPr>
+        <w:t>Página 5: PQR y horas de servicio</w:t>
+      </w:r>
+    </w:p>
+    <w:p>
+      <w:r>
+        <w:drawing>
+          <wp:inline xmlns:a="http://schemas.openxmlformats.org/drawingml/2006/main" xmlns:pic="http://schemas.openxmlformats.org/drawingml/2006/picture">
+            <wp:extent cx="5760720" cy="3280465"/>
+            <wp:docPr id="7" name="Picture 7"/>
+            <wp:cNvGraphicFramePr>
+              <a:graphicFrameLocks noChangeAspect="1"/>
+            </wp:cNvGraphicFramePr>
+            <a:graphic>
+              <a:graphicData uri="http://schemas.openxmlformats.org/drawingml/2006/picture">
+                <pic:pic>
+                  <pic:nvPicPr>
+                    <pic:cNvPr id="0" name="pagina_6_peor_desempeno.png"/>
+                    <pic:cNvPicPr/>
+                  </pic:nvPicPr>
+                  <pic:blipFill>
+                    <a:blip r:embed="rId14"/>
+                    <a:stretch>
+                      <a:fillRect/>
+                    </a:stretch>
+                  </pic:blipFill>
+                  <pic:spPr>
+                    <a:xfrm>
+                      <a:off x="0" y="0"/>
+                      <a:ext cx="5760720" cy="3280465"/>
+                    </a:xfrm>
+                    <a:prstGeom prst="rect"/>
+                  </pic:spPr>
+                </pic:pic>
+              </a:graphicData>
+            </a:graphic>
+          </wp:inline>
+        </w:drawing>
+      </w:r>
+    </w:p>
+    <w:p>
+      <w:r>
+        <w:rPr>
+          <w:i/>
+          <w:sz w:val="18"/>
+        </w:rPr>
+        <w:t>Página 6: peor desempeño combinado</w:t>
+      </w:r>
+    </w:p>
+    <w:p>
+      <w:r>
+        <w:drawing>
+          <wp:inline xmlns:a="http://schemas.openxmlformats.org/drawingml/2006/main" xmlns:pic="http://schemas.openxmlformats.org/drawingml/2006/picture">
+            <wp:extent cx="5760720" cy="4093248"/>
+            <wp:docPr id="8" name="Picture 8"/>
+            <wp:cNvGraphicFramePr>
+              <a:graphicFrameLocks noChangeAspect="1"/>
+            </wp:cNvGraphicFramePr>
+            <a:graphic>
+              <a:graphicData uri="http://schemas.openxmlformats.org/drawingml/2006/picture">
+                <pic:pic>
+                  <pic:nvPicPr>
+                    <pic:cNvPr id="0" name="pagina_7_calidad_frescura.png"/>
+                    <pic:cNvPicPr/>
+                  </pic:nvPicPr>
+                  <pic:blipFill>
+                    <a:blip r:embed="rId15"/>
+                    <a:stretch>
+                      <a:fillRect/>
+                    </a:stretch>
+                  </pic:blipFill>
+                  <pic:spPr>
+                    <a:xfrm>
+                      <a:off x="0" y="0"/>
+                      <a:ext cx="5760720" cy="4093248"/>
+                    </a:xfrm>
+                    <a:prstGeom prst="rect"/>
+                  </pic:spPr>
+                </pic:pic>
+              </a:graphicData>
+            </a:graphic>
+          </wp:inline>
+        </w:drawing>
+      </w:r>
+    </w:p>
+    <w:p>
+      <w:r>
+        <w:rPr>
+          <w:i/>
+          <w:sz w:val="18"/>
+        </w:rPr>
+        <w:t>Página 7: calidad y frescura</w:t>
+      </w:r>
+    </w:p>
     <w:sectPr>
       <w:pgSz w:w="12240" w:h="15840"/>
       <w:pgMar w:top="1120" w:right="1200" w:bottom="1120" w:left="1200" w:header="720" w:footer="720" w:gutter="0"/>

</xml_diff>